<commit_message>
Fix Figure 1/2/4/12 legends to match final figures
</commit_message>
<xml_diff>
--- a/submission/Manuscript/05_Figure_Legends.docx
+++ b/submission/Manuscript/05_Figure_Legends.docx
@@ -21,13 +21,13 @@
           <w:b/>
           <w:bCs/>
         </w:rPr>
-        <w:t xml:space="preserve">Figure 1 | Study design and analytical workflow.</w:t>
+        <w:t xml:space="preserve">Figure 1 | A computational framework for discovering a therapeutically targetable malignant cell state in glioblastoma.</w:t>
       </w:r>
       <w:r>
         <w:t xml:space="preserve"> </w:t>
       </w:r>
       <w:r>
-        <w:t xml:space="preserve">Overview of data sources (single-cell RNA-seq, spatial transcriptomics, CPTAC TMT proteomics/acetylomics, eight bulk cohorts, DepMap/GDSC2 pharmacogenomics), the WEBS computation, and the three-tier analysis (discovery, validation, therapeutic nomination). (Original figure retained from v16.)</w:t>
+        <w:t xml:space="preserve">Six data sources (scRNA-seq of 35,823 cells, spatial transcriptomics, snATAC-seq, eight bulk cohorts, CPTAC proteomics, DepMap/GDSC2) feed the Writer–Eraser Balance Score (WEBS), followed by a three-tier analysis (Discovery: cell-state landscape and hypoxia decoupling; Mechanism: post-transcriptional spliceosome accumulation and acetylation coupling; Translation: six-gene signature, pharmacogenomics, molecular docking). Key finding callout: protein ρ = +0.79 vs mRNA ρ = −0.03.</w:t>
       </w:r>
     </w:p>
     <w:p>
@@ -45,7 +45,7 @@
         <w:t xml:space="preserve"> </w:t>
       </w:r>
       <w:r>
-        <w:t xml:space="preserve">(A) UMAP of 35,823 cells from 20 GBM tumor samples colored by cell type. (B) WEBS projected onto the UMAP. (C) WEBS distribution by cell type. (D) IQR-based stratification into LLS (bottom 25%), LDTS (middle 50%), and LHS (top 25%).</w:t>
+        <w:t xml:space="preserve">(a) Cell-type annotation of 35,823 cells from 20 GBM tumor samples (marker-based with original-study labels). (b) WEBS projected onto the UMAP embedding. (c) WEBS distribution across the IQR-defined groups (LLS, bottom 25%; LDTS, middle 50%; LHS, top 25%; Kruskal–Wallis p &lt; 10⁻³⁰⁰).</w:t>
       </w:r>
     </w:p>
     <w:p>
@@ -75,13 +75,13 @@
           <w:b/>
           <w:bCs/>
         </w:rPr>
-        <w:t xml:space="preserve">Figure 4 | WEBS is decoupled from canonical hypoxia.</w:t>
+        <w:t xml:space="preserve">Figure 4 | WEBS is decoupled from canonical hypoxia markers.</w:t>
       </w:r>
       <w:r>
         <w:t xml:space="preserve"> </w:t>
       </w:r>
       <w:r>
-        <w:t xml:space="preserve">(A) WEBS vs Hallmark Hypoxia score in malignant cells (ρ = −0.054). (B) WEBS by tumor region in malignant cells; the Margin-like association persists after hypoxia adjustment (logistic regression p = 3.8 × 10⁻⁴).</w:t>
+        <w:t xml:space="preserve">(a) WEBS across invasion region types (all cells; Kruskal–Wallis p &lt; 2.2 × 10⁻¹⁶). (b) Patient-level paired Margin vs Core WEBS (paired Wilcoxon, n = 17). (c) WEBS vs CA9 + VEGFA score (all cells, n = 35,823; within malignant cells ρ = −0.054). (d) Hallmark Hypoxia score by WEBS group; the Margin-like association persists after hypoxia adjustment (logistic regression p = 3.8 × 10⁻⁴).</w:t>
       </w:r>
     </w:p>
     <w:p>

</xml_diff>